<commit_message>
docs(feedback): redesign R4 feedback (clean light layout) + add rendered PDF
- Rebuild the docx with a light, conventional layout: accent-ruled title,
  light stat cards, clean section headings (drops the heavy dark title band)
- Add a rendered PDF as the primary shareable artifact
- Link both from the README
</commit_message>
<xml_diff>
--- a/reports/DreamDEX-R4-Feedback.docx
+++ b/reports/DreamDEX-R4-Feedback.docx
@@ -2,6 +2,61 @@
 <file path=word/document.xml><?xml version="1.0" encoding="utf-8"?>
 <w:document xmlns:wpc="http://schemas.microsoft.com/office/word/2010/wordprocessingCanvas" xmlns:mc="http://schemas.openxmlformats.org/markup-compatibility/2006" xmlns:o="urn:schemas-microsoft-com:office:office" xmlns:r="http://schemas.openxmlformats.org/officeDocument/2006/relationships" xmlns:m="http://schemas.openxmlformats.org/officeDocument/2006/math" xmlns:v="urn:schemas-microsoft-com:vml" xmlns:wp14="http://schemas.microsoft.com/office/word/2010/wordprocessingDrawing" xmlns:wp="http://schemas.openxmlformats.org/drawingml/2006/wordprocessingDrawing" xmlns:w10="urn:schemas-microsoft-com:office:word" xmlns:w="http://schemas.openxmlformats.org/wordprocessingml/2006/main" xmlns:w14="http://schemas.microsoft.com/office/word/2010/wordml" xmlns:w15="http://schemas.microsoft.com/office/word/2012/wordml" xmlns:wpg="http://schemas.microsoft.com/office/word/2010/wordprocessingGroup" xmlns:wpi="http://schemas.microsoft.com/office/word/2010/wordprocessingInk" xmlns:wne="http://schemas.microsoft.com/office/word/2006/wordml" xmlns:wps="http://schemas.microsoft.com/office/word/2010/wordprocessingShape" xmlns:cx="http://schemas.microsoft.com/office/drawing/2014/chartex" xmlns:cx1="http://schemas.microsoft.com/office/drawing/2015/9/8/chartex" xmlns:cx2="http://schemas.microsoft.com/office/drawing/2015/10/21/chartex" xmlns:cx3="http://schemas.microsoft.com/office/drawing/2016/5/9/chartex" xmlns:cx4="http://schemas.microsoft.com/office/drawing/2016/5/10/chartex" xmlns:cx5="http://schemas.microsoft.com/office/drawing/2016/5/11/chartex" xmlns:cx6="http://schemas.microsoft.com/office/drawing/2016/5/12/chartex" xmlns:cx7="http://schemas.microsoft.com/office/drawing/2016/5/13/chartex" xmlns:cx8="http://schemas.microsoft.com/office/drawing/2016/5/14/chartex" xmlns:aink="http://schemas.microsoft.com/office/drawing/2016/ink" xmlns:am3d="http://schemas.microsoft.com/office/drawing/2017/model3d" xmlns:w16cex="http://schemas.microsoft.com/office/word/2018/wordml/cex" xmlns:w16cid="http://schemas.microsoft.com/office/word/2016/wordml/cid" xmlns:w16="http://schemas.microsoft.com/office/word/2018/wordml" xmlns:w16sdtdh="http://schemas.microsoft.com/office/word/2020/wordml/sdtdatahash" xmlns:w16se="http://schemas.microsoft.com/office/word/2015/wordml/symex" mc:Ignorable="w14 w15 wp14">
   <w:body>
+    <w:p>
+      <w:pPr>
+        <w:spacing w:after="40"/>
+      </w:pPr>
+      <w:r>
+        <w:rPr>
+          <w:rFonts w:ascii="Arial" w:cs="Arial" w:eastAsia="Arial" w:hAnsi="Arial"/>
+          <w:b/>
+          <w:bCs/>
+          <w:color w:val="3457C5"/>
+          <w:spacing w:val="34"/>
+          <w:sz w:val="16"/>
+          <w:szCs w:val="16"/>
+        </w:rPr>
+        <w:t xml:space="preserve">DREAMDEX · SOMNIA MAINNET</w:t>
+      </w:r>
+    </w:p>
+    <w:p>
+      <w:pPr>
+        <w:spacing w:after="60"/>
+      </w:pPr>
+      <w:r>
+        <w:rPr>
+          <w:rFonts w:ascii="Arial" w:cs="Arial" w:eastAsia="Arial" w:hAnsi="Arial"/>
+          <w:b/>
+          <w:bCs/>
+          <w:color w:val="141824"/>
+          <w:sz w:val="44"/>
+          <w:szCs w:val="44"/>
+        </w:rPr>
+        <w:t xml:space="preserve">Round 4 — Builder Feedback</w:t>
+      </w:r>
+    </w:p>
+    <w:p>
+      <w:pPr>
+        <w:pBdr>
+          <w:bottom w:val="single" w:color="3457C5" w:sz="12" w:space="10"/>
+        </w:pBdr>
+        <w:spacing w:after="120"/>
+      </w:pPr>
+      <w:r>
+        <w:rPr>
+          <w:rFonts w:ascii="Arial" w:cs="Arial" w:eastAsia="Arial" w:hAnsi="Arial"/>
+          <w:color w:val="5A6072"/>
+          <w:sz w:val="20"/>
+          <w:szCs w:val="20"/>
+        </w:rPr>
+        <w:t xml:space="preserve">Feedback on the DreamDEX protocol — mechanics, execution, and docs — from building and running an autonomous trading agent through the Round 4 volume contest.</w:t>
+      </w:r>
+    </w:p>
+    <w:p>
+      <w:pPr>
+        <w:spacing w:after="140"/>
+      </w:pPr>
+    </w:p>
     <w:tbl>
       <w:tblPr>
         <w:tblW w:type="dxa" w:w="9360"/>
@@ -15,85 +70,6 @@
         </w:tblBorders>
       </w:tblPr>
       <w:tblGrid>
-        <w:gridCol w:w="9360"/>
-      </w:tblGrid>
-      <w:tr>
-        <w:tc>
-          <w:tcPr>
-            <w:tcW w:type="dxa" w:w="9360"/>
-            <w:shd w:fill="13131C" w:val="clear"/>
-            <w:tcMar>
-              <w:top w:type="dxa" w:w="220"/>
-              <w:left w:type="dxa" w:w="260"/>
-              <w:bottom w:type="dxa" w:w="220"/>
-              <w:right w:type="dxa" w:w="260"/>
-            </w:tcMar>
-          </w:tcPr>
-          <w:p>
-            <w:r>
-              <w:rPr>
-                <w:rFonts w:ascii="Calibri" w:cs="Calibri" w:eastAsia="Calibri" w:hAnsi="Calibri"/>
-                <w:b/>
-                <w:bCs/>
-                <w:color w:val="6E86E8"/>
-                <w:spacing w:val="34"/>
-                <w:sz w:val="16"/>
-                <w:szCs w:val="16"/>
-              </w:rPr>
-              <w:t xml:space="preserve">DREAMDEX · SOMNIA MAINNET</w:t>
-            </w:r>
-          </w:p>
-          <w:p>
-            <w:pPr>
-              <w:spacing w:before="40"/>
-            </w:pPr>
-            <w:r>
-              <w:rPr>
-                <w:rFonts w:ascii="Calibri" w:cs="Calibri" w:eastAsia="Calibri" w:hAnsi="Calibri"/>
-                <w:b/>
-                <w:bCs/>
-                <w:color w:val="FFFFFF"/>
-                <w:sz w:val="38"/>
-                <w:szCs w:val="38"/>
-              </w:rPr>
-              <w:t xml:space="preserve">Round 4 — Builder Feedback</w:t>
-            </w:r>
-          </w:p>
-          <w:p>
-            <w:pPr>
-              <w:spacing w:before="60"/>
-            </w:pPr>
-            <w:r>
-              <w:rPr>
-                <w:rFonts w:ascii="Calibri" w:cs="Calibri" w:eastAsia="Calibri" w:hAnsi="Calibri"/>
-                <w:color w:val="C9CEE6"/>
-                <w:sz w:val="19"/>
-                <w:szCs w:val="19"/>
-              </w:rPr>
-              <w:t xml:space="preserve">Feedback on the DreamDEX protocol — mechanics, execution, and docs — from building and running an autonomous trading agent through the Round 4 volume contest.</w:t>
-            </w:r>
-          </w:p>
-        </w:tc>
-      </w:tr>
-    </w:tbl>
-    <w:p>
-      <w:pPr>
-        <w:spacing w:after="120"/>
-      </w:pPr>
-    </w:p>
-    <w:tbl>
-      <w:tblPr>
-        <w:tblW w:type="dxa" w:w="9360"/>
-        <w:tblBorders>
-          <w:top w:val="single" w:color="auto" w:sz="4"/>
-          <w:left w:val="single" w:color="auto" w:sz="4"/>
-          <w:bottom w:val="single" w:color="auto" w:sz="4"/>
-          <w:right w:val="single" w:color="auto" w:sz="4"/>
-          <w:insideH w:val="single" w:color="auto" w:sz="4"/>
-          <w:insideV w:val="single" w:color="auto" w:sz="4"/>
-        </w:tblBorders>
-      </w:tblPr>
-      <w:tblGrid>
         <w:gridCol w:w="3120"/>
         <w:gridCol w:w="3120"/>
         <w:gridCol w:w="3120"/>
@@ -103,32 +79,32 @@
           <w:tcPr>
             <w:tcW w:type="dxa" w:w="3120"/>
             <w:tcBorders>
-              <w:top w:val="single" w:color="D8DCEA" w:sz="1"/>
-              <w:left w:val="single" w:color="D8DCEA" w:sz="1"/>
-              <w:bottom w:val="single" w:color="D8DCEA" w:sz="1"/>
-              <w:right w:val="single" w:color="D8DCEA" w:sz="1"/>
+              <w:top w:val="single" w:color="E2E5EE" w:sz="4"/>
+              <w:left w:val="single" w:color="E2E5EE" w:sz="4"/>
+              <w:bottom w:val="single" w:color="E2E5EE" w:sz="4"/>
+              <w:right w:val="single" w:color="E2E5EE" w:sz="4"/>
             </w:tcBorders>
-            <w:shd w:fill="EEF1FC" w:val="clear"/>
+            <w:shd w:fill="FAFBFE" w:val="clear"/>
             <w:tcMar>
-              <w:top w:type="dxa" w:w="120"/>
-              <w:left w:type="dxa" w:w="140"/>
-              <w:bottom w:type="dxa" w:w="120"/>
-              <w:right w:type="dxa" w:w="140"/>
+              <w:top w:type="dxa" w:w="150"/>
+              <w:left w:type="dxa" w:w="120"/>
+              <w:bottom w:type="dxa" w:w="150"/>
+              <w:right w:type="dxa" w:w="120"/>
             </w:tcMar>
           </w:tcPr>
           <w:p>
             <w:pPr>
-              <w:spacing w:after="20"/>
+              <w:spacing w:after="30"/>
               <w:jc w:val="center"/>
             </w:pPr>
             <w:r>
               <w:rPr>
-                <w:rFonts w:ascii="Calibri" w:cs="Calibri" w:eastAsia="Calibri" w:hAnsi="Calibri"/>
+                <w:rFonts w:ascii="Arial" w:cs="Arial" w:eastAsia="Arial" w:hAnsi="Arial"/>
                 <w:b/>
                 <w:bCs/>
-                <w:color w:val="2E5BD6"/>
-                <w:sz w:val="30"/>
-                <w:szCs w:val="30"/>
+                <w:color w:val="3457C5"/>
+                <w:sz w:val="32"/>
+                <w:szCs w:val="32"/>
               </w:rPr>
               <w:t xml:space="preserve">1,501,818</w:t>
             </w:r>
@@ -139,12 +115,13 @@
             </w:pPr>
             <w:r>
               <w:rPr>
-                <w:rFonts w:ascii="Calibri" w:cs="Calibri" w:eastAsia="Calibri" w:hAnsi="Calibri"/>
-                <w:color w:val="6A6A78"/>
-                <w:sz w:val="16"/>
-                <w:szCs w:val="16"/>
+                <w:rFonts w:ascii="Arial" w:cs="Arial" w:eastAsia="Arial" w:hAnsi="Arial"/>
+                <w:color w:val="5A6072"/>
+                <w:spacing w:val="8"/>
+                <w:sz w:val="15"/>
+                <w:szCs w:val="15"/>
               </w:rPr>
-              <w:t xml:space="preserve">USDso volume</w:t>
+              <w:t xml:space="preserve">USDSO VOLUME</w:t>
             </w:r>
           </w:p>
         </w:tc>
@@ -152,32 +129,32 @@
           <w:tcPr>
             <w:tcW w:type="dxa" w:w="3120"/>
             <w:tcBorders>
-              <w:top w:val="single" w:color="D8DCEA" w:sz="1"/>
-              <w:left w:val="single" w:color="D8DCEA" w:sz="1"/>
-              <w:bottom w:val="single" w:color="D8DCEA" w:sz="1"/>
-              <w:right w:val="single" w:color="D8DCEA" w:sz="1"/>
+              <w:top w:val="single" w:color="E2E5EE" w:sz="4"/>
+              <w:left w:val="single" w:color="E2E5EE" w:sz="4"/>
+              <w:bottom w:val="single" w:color="E2E5EE" w:sz="4"/>
+              <w:right w:val="single" w:color="E2E5EE" w:sz="4"/>
             </w:tcBorders>
-            <w:shd w:fill="EEF1FC" w:val="clear"/>
+            <w:shd w:fill="FAFBFE" w:val="clear"/>
             <w:tcMar>
-              <w:top w:type="dxa" w:w="120"/>
-              <w:left w:type="dxa" w:w="140"/>
-              <w:bottom w:type="dxa" w:w="120"/>
-              <w:right w:type="dxa" w:w="140"/>
+              <w:top w:type="dxa" w:w="150"/>
+              <w:left w:type="dxa" w:w="120"/>
+              <w:bottom w:type="dxa" w:w="150"/>
+              <w:right w:type="dxa" w:w="120"/>
             </w:tcMar>
           </w:tcPr>
           <w:p>
             <w:pPr>
-              <w:spacing w:after="20"/>
+              <w:spacing w:after="30"/>
               <w:jc w:val="center"/>
             </w:pPr>
             <w:r>
               <w:rPr>
-                <w:rFonts w:ascii="Calibri" w:cs="Calibri" w:eastAsia="Calibri" w:hAnsi="Calibri"/>
+                <w:rFonts w:ascii="Arial" w:cs="Arial" w:eastAsia="Arial" w:hAnsi="Arial"/>
                 <w:b/>
                 <w:bCs/>
-                <w:color w:val="2E5BD6"/>
-                <w:sz w:val="30"/>
-                <w:szCs w:val="30"/>
+                <w:color w:val="3457C5"/>
+                <w:sz w:val="32"/>
+                <w:szCs w:val="32"/>
               </w:rPr>
               <w:t xml:space="preserve">~$130k/hr</w:t>
             </w:r>
@@ -188,12 +165,13 @@
             </w:pPr>
             <w:r>
               <w:rPr>
-                <w:rFonts w:ascii="Calibri" w:cs="Calibri" w:eastAsia="Calibri" w:hAnsi="Calibri"/>
-                <w:color w:val="6A6A78"/>
-                <w:sz w:val="16"/>
-                <w:szCs w:val="16"/>
+                <w:rFonts w:ascii="Arial" w:cs="Arial" w:eastAsia="Arial" w:hAnsi="Arial"/>
+                <w:color w:val="5A6072"/>
+                <w:spacing w:val="8"/>
+                <w:sz w:val="15"/>
+                <w:szCs w:val="15"/>
               </w:rPr>
-              <w:t xml:space="preserve">peak throughput</w:t>
+              <w:t xml:space="preserve">PEAK THROUGHPUT</w:t>
             </w:r>
           </w:p>
         </w:tc>
@@ -201,32 +179,32 @@
           <w:tcPr>
             <w:tcW w:type="dxa" w:w="3120"/>
             <w:tcBorders>
-              <w:top w:val="single" w:color="D8DCEA" w:sz="1"/>
-              <w:left w:val="single" w:color="D8DCEA" w:sz="1"/>
-              <w:bottom w:val="single" w:color="D8DCEA" w:sz="1"/>
-              <w:right w:val="single" w:color="D8DCEA" w:sz="1"/>
+              <w:top w:val="single" w:color="E2E5EE" w:sz="4"/>
+              <w:left w:val="single" w:color="E2E5EE" w:sz="4"/>
+              <w:bottom w:val="single" w:color="E2E5EE" w:sz="4"/>
+              <w:right w:val="single" w:color="E2E5EE" w:sz="4"/>
             </w:tcBorders>
-            <w:shd w:fill="EEF1FC" w:val="clear"/>
+            <w:shd w:fill="FAFBFE" w:val="clear"/>
             <w:tcMar>
-              <w:top w:type="dxa" w:w="120"/>
-              <w:left w:type="dxa" w:w="140"/>
-              <w:bottom w:type="dxa" w:w="120"/>
-              <w:right w:type="dxa" w:w="140"/>
+              <w:top w:type="dxa" w:w="150"/>
+              <w:left w:type="dxa" w:w="120"/>
+              <w:bottom w:type="dxa" w:w="150"/>
+              <w:right w:type="dxa" w:w="120"/>
             </w:tcMar>
           </w:tcPr>
           <w:p>
             <w:pPr>
-              <w:spacing w:after="20"/>
+              <w:spacing w:after="30"/>
               <w:jc w:val="center"/>
             </w:pPr>
             <w:r>
               <w:rPr>
-                <w:rFonts w:ascii="Calibri" w:cs="Calibri" w:eastAsia="Calibri" w:hAnsi="Calibri"/>
+                <w:rFonts w:ascii="Arial" w:cs="Arial" w:eastAsia="Arial" w:hAnsi="Arial"/>
                 <w:b/>
                 <w:bCs/>
-                <w:color w:val="2E5BD6"/>
-                <w:sz w:val="30"/>
-                <w:szCs w:val="30"/>
+                <w:color w:val="3457C5"/>
+                <w:sz w:val="32"/>
+                <w:szCs w:val="32"/>
               </w:rPr>
               <w:t xml:space="preserve">~3×</w:t>
             </w:r>
@@ -237,12 +215,13 @@
             </w:pPr>
             <w:r>
               <w:rPr>
-                <w:rFonts w:ascii="Calibri" w:cs="Calibri" w:eastAsia="Calibri" w:hAnsi="Calibri"/>
-                <w:color w:val="6A6A78"/>
-                <w:sz w:val="16"/>
-                <w:szCs w:val="16"/>
+                <w:rFonts w:ascii="Arial" w:cs="Arial" w:eastAsia="Arial" w:hAnsi="Arial"/>
+                <w:color w:val="5A6072"/>
+                <w:spacing w:val="8"/>
+                <w:sz w:val="15"/>
+                <w:szCs w:val="15"/>
               </w:rPr>
-              <w:t xml:space="preserve">gas efficiency vs 2-tx</w:t>
+              <w:t xml:space="preserve">GAS EFFICIENCY VS 2-TX</w:t>
             </w:r>
           </w:p>
         </w:tc>
@@ -250,7 +229,7 @@
     </w:tbl>
     <w:p>
       <w:pPr>
-        <w:spacing w:after="80"/>
+        <w:spacing w:after="60"/>
       </w:pPr>
     </w:p>
     <w:p>
@@ -259,7 +238,7 @@
       </w:pPr>
       <w:r>
         <w:rPr>
-          <w:rFonts w:ascii="Calibri" w:cs="Calibri" w:eastAsia="Calibri" w:hAnsi="Calibri"/>
+          <w:rFonts w:ascii="Arial" w:cs="Arial" w:eastAsia="Arial" w:hAnsi="Arial"/>
         </w:rPr>
         <w:t xml:space="preserve">The round in one paragraph</w:t>
       </w:r>
@@ -267,13 +246,13 @@
     <w:p>
       <w:r>
         <w:rPr>
-          <w:rFonts w:ascii="Calibri" w:cs="Calibri" w:eastAsia="Calibri" w:hAnsi="Calibri"/>
+          <w:rFonts w:ascii="Arial" w:cs="Arial" w:eastAsia="Arial" w:hAnsi="Arial"/>
         </w:rPr>
         <w:t xml:space="preserve">Reached </w:t>
       </w:r>
       <w:r>
         <w:rPr>
-          <w:rFonts w:ascii="Calibri" w:cs="Calibri" w:eastAsia="Calibri" w:hAnsi="Calibri"/>
+          <w:rFonts w:ascii="Arial" w:cs="Arial" w:eastAsia="Arial" w:hAnsi="Arial"/>
           <w:b/>
           <w:bCs/>
         </w:rPr>
@@ -281,13 +260,13 @@
       </w:r>
       <w:r>
         <w:rPr>
-          <w:rFonts w:ascii="Calibri" w:cs="Calibri" w:eastAsia="Calibri" w:hAnsi="Calibri"/>
+          <w:rFonts w:ascii="Arial" w:cs="Arial" w:eastAsia="Arial" w:hAnsi="Arial"/>
         </w:rPr>
         <w:t xml:space="preserve"> of volume. The engineering focus was an </w:t>
       </w:r>
       <w:r>
         <w:rPr>
-          <w:rFonts w:ascii="Calibri" w:cs="Calibri" w:eastAsia="Calibri" w:hAnsi="Calibri"/>
+          <w:rFonts w:ascii="Arial" w:cs="Arial" w:eastAsia="Arial" w:hAnsi="Arial"/>
           <w:b/>
           <w:bCs/>
         </w:rPr>
@@ -295,13 +274,13 @@
       </w:r>
       <w:r>
         <w:rPr>
-          <w:rFonts w:ascii="Calibri" w:cs="Calibri" w:eastAsia="Calibri" w:hAnsi="Calibri"/>
+          <w:rFonts w:ascii="Arial" w:cs="Arial" w:eastAsia="Arial" w:hAnsi="Arial"/>
         </w:rPr>
         <w:t xml:space="preserve"> that places a buy and a sell in a single transaction, plus </w:t>
       </w:r>
       <w:r>
         <w:rPr>
-          <w:rFonts w:ascii="Calibri" w:cs="Calibri" w:eastAsia="Calibri" w:hAnsi="Calibri"/>
+          <w:rFonts w:ascii="Arial" w:cs="Arial" w:eastAsia="Arial" w:hAnsi="Arial"/>
           <w:b/>
           <w:bCs/>
         </w:rPr>
@@ -309,13 +288,13 @@
       </w:r>
       <w:r>
         <w:rPr>
-          <w:rFonts w:ascii="Calibri" w:cs="Calibri" w:eastAsia="Calibri" w:hAnsi="Calibri"/>
+          <w:rFonts w:ascii="Arial" w:cs="Arial" w:eastAsia="Arial" w:hAnsi="Arial"/>
         </w:rPr>
         <w:t xml:space="preserve"> that fits each round-trip to the top-of-book depth. With zero protocol fees, the only costs are the </w:t>
       </w:r>
       <w:r>
         <w:rPr>
-          <w:rFonts w:ascii="Calibri" w:cs="Calibri" w:eastAsia="Calibri" w:hAnsi="Calibri"/>
+          <w:rFonts w:ascii="Arial" w:cs="Arial" w:eastAsia="Arial" w:hAnsi="Arial"/>
           <w:b/>
           <w:bCs/>
         </w:rPr>
@@ -323,13 +302,13 @@
       </w:r>
       <w:r>
         <w:rPr>
-          <w:rFonts w:ascii="Calibri" w:cs="Calibri" w:eastAsia="Calibri" w:hAnsi="Calibri"/>
+          <w:rFonts w:ascii="Arial" w:cs="Arial" w:eastAsia="Arial" w:hAnsi="Arial"/>
         </w:rPr>
         <w:t xml:space="preserve"> (the toll) and </w:t>
       </w:r>
       <w:r>
         <w:rPr>
-          <w:rFonts w:ascii="Calibri" w:cs="Calibri" w:eastAsia="Calibri" w:hAnsi="Calibri"/>
+          <w:rFonts w:ascii="Arial" w:cs="Arial" w:eastAsia="Arial" w:hAnsi="Arial"/>
           <w:b/>
           <w:bCs/>
         </w:rPr>
@@ -337,13 +316,13 @@
       </w:r>
       <w:r>
         <w:rPr>
-          <w:rFonts w:ascii="Calibri" w:cs="Calibri" w:eastAsia="Calibri" w:hAnsi="Calibri"/>
+          <w:rFonts w:ascii="Arial" w:cs="Arial" w:eastAsia="Arial" w:hAnsi="Arial"/>
         </w:rPr>
         <w:t xml:space="preserve"> — the toll is ~fixed per $1k of volume, gas is ~fixed per transaction. So the efficient move is fewer, larger transactions on the deepest book. On a deep book the atomic engine sustained </w:t>
       </w:r>
       <w:r>
         <w:rPr>
-          <w:rFonts w:ascii="Calibri" w:cs="Calibri" w:eastAsia="Calibri" w:hAnsi="Calibri"/>
+          <w:rFonts w:ascii="Arial" w:cs="Arial" w:eastAsia="Arial" w:hAnsi="Arial"/>
           <w:b/>
           <w:bCs/>
         </w:rPr>
@@ -351,7 +330,7 @@
       </w:r>
       <w:r>
         <w:rPr>
-          <w:rFonts w:ascii="Calibri" w:cs="Calibri" w:eastAsia="Calibri" w:hAnsi="Calibri"/>
+          <w:rFonts w:ascii="Arial" w:cs="Arial" w:eastAsia="Arial" w:hAnsi="Arial"/>
         </w:rPr>
         <w:t xml:space="preserve"> at close to the spread floor.</w:t>
       </w:r>
@@ -362,7 +341,7 @@
       </w:pPr>
       <w:r>
         <w:rPr>
-          <w:rFonts w:ascii="Calibri" w:cs="Calibri" w:eastAsia="Calibri" w:hAnsi="Calibri"/>
+          <w:rFonts w:ascii="Arial" w:cs="Arial" w:eastAsia="Arial" w:hAnsi="Arial"/>
         </w:rPr>
         <w:t xml:space="preserve">What worked well</w:t>
       </w:r>
@@ -374,26 +353,26 @@
           <w:ilvl w:val="0"/>
           <w:numId w:val="2"/>
         </w:numPr>
-        <w:spacing w:after="90"/>
-      </w:pPr>
-      <w:r>
-        <w:rPr>
-          <w:rFonts w:ascii="Calibri" w:cs="Calibri" w:eastAsia="Calibri" w:hAnsi="Calibri"/>
-          <w:b/>
-          <w:bCs/>
-          <w:color w:val="1E9E5A"/>
+        <w:spacing w:after="110"/>
+      </w:pPr>
+      <w:r>
+        <w:rPr>
+          <w:rFonts w:ascii="Arial" w:cs="Arial" w:eastAsia="Arial" w:hAnsi="Arial"/>
+          <w:b/>
+          <w:bCs/>
+          <w:color w:val="1A8A4F"/>
         </w:rPr>
         <w:t xml:space="preserve">EIP-7702 atomic execution</w:t>
       </w:r>
       <w:r>
         <w:rPr>
-          <w:rFonts w:ascii="Calibri" w:cs="Calibri" w:eastAsia="Calibri" w:hAnsi="Calibri"/>
+          <w:rFonts w:ascii="Arial" w:cs="Arial" w:eastAsia="Arial" w:hAnsi="Arial"/>
         </w:rPr>
         <w:t xml:space="preserve"> is the standout. Bundling buy+sell into one transaction removed leftover-inventory risk entirely and roughly </w:t>
       </w:r>
       <w:r>
         <w:rPr>
-          <w:rFonts w:ascii="Calibri" w:cs="Calibri" w:eastAsia="Calibri" w:hAnsi="Calibri"/>
+          <w:rFonts w:ascii="Arial" w:cs="Arial" w:eastAsia="Arial" w:hAnsi="Arial"/>
           <w:b/>
           <w:bCs/>
         </w:rPr>
@@ -401,7 +380,7 @@
       </w:r>
       <w:r>
         <w:rPr>
-          <w:rFonts w:ascii="Calibri" w:cs="Calibri" w:eastAsia="Calibri" w:hAnsi="Calibri"/>
+          <w:rFonts w:ascii="Arial" w:cs="Arial" w:eastAsia="Arial" w:hAnsi="Arial"/>
         </w:rPr>
         <w:t xml:space="preserve"> versus two separate transactions — a great primitive on an L1 CLOB, making round-trip strategies both cheaper and safer.</w:t>
       </w:r>
@@ -413,20 +392,20 @@
           <w:ilvl w:val="0"/>
           <w:numId w:val="2"/>
         </w:numPr>
-        <w:spacing w:after="90"/>
-      </w:pPr>
-      <w:r>
-        <w:rPr>
-          <w:rFonts w:ascii="Calibri" w:cs="Calibri" w:eastAsia="Calibri" w:hAnsi="Calibri"/>
-          <w:b/>
-          <w:bCs/>
-          <w:color w:val="1E9E5A"/>
+        <w:spacing w:after="110"/>
+      </w:pPr>
+      <w:r>
+        <w:rPr>
+          <w:rFonts w:ascii="Arial" w:cs="Arial" w:eastAsia="Arial" w:hAnsi="Arial"/>
+          <w:b/>
+          <w:bCs/>
+          <w:color w:val="1A8A4F"/>
         </w:rPr>
         <w:t xml:space="preserve">Zero protocol fees</w:t>
       </w:r>
       <w:r>
         <w:rPr>
-          <w:rFonts w:ascii="Calibri" w:cs="Calibri" w:eastAsia="Calibri" w:hAnsi="Calibri"/>
+          <w:rFonts w:ascii="Arial" w:cs="Arial" w:eastAsia="Arial" w:hAnsi="Arial"/>
         </w:rPr>
         <w:t xml:space="preserve"> make the cost model clean: spread plus gas, nothing hidden. It rewards good execution rather than fee arbitrage.</w:t>
       </w:r>
@@ -438,20 +417,20 @@
           <w:ilvl w:val="0"/>
           <w:numId w:val="2"/>
         </w:numPr>
-        <w:spacing w:after="90"/>
-      </w:pPr>
-      <w:r>
-        <w:rPr>
-          <w:rFonts w:ascii="Calibri" w:cs="Calibri" w:eastAsia="Calibri" w:hAnsi="Calibri"/>
-          <w:b/>
-          <w:bCs/>
-          <w:color w:val="1E9E5A"/>
+        <w:spacing w:after="110"/>
+      </w:pPr>
+      <w:r>
+        <w:rPr>
+          <w:rFonts w:ascii="Arial" w:cs="Arial" w:eastAsia="Arial" w:hAnsi="Arial"/>
+          <w:b/>
+          <w:bCs/>
+          <w:color w:val="1A8A4F"/>
         </w:rPr>
         <w:t xml:space="preserve">Deep books absorbed large legs</w:t>
       </w:r>
       <w:r>
         <w:rPr>
-          <w:rFonts w:ascii="Calibri" w:cs="Calibri" w:eastAsia="Calibri" w:hAnsi="Calibri"/>
+          <w:rFonts w:ascii="Arial" w:cs="Arial" w:eastAsia="Arial" w:hAnsi="Arial"/>
         </w:rPr>
         <w:t xml:space="preserve"> with negligible price impact — $198 legs on the deep pair moved at ~the quoted spread.</w:t>
       </w:r>
@@ -462,7 +441,7 @@
       </w:pPr>
       <w:r>
         <w:rPr>
-          <w:rFonts w:ascii="Calibri" w:cs="Calibri" w:eastAsia="Calibri" w:hAnsi="Calibri"/>
+          <w:rFonts w:ascii="Arial" w:cs="Arial" w:eastAsia="Arial" w:hAnsi="Arial"/>
         </w:rPr>
         <w:t xml:space="preserve">Protocol notes &amp; suggestions</w:t>
       </w:r>
@@ -473,7 +452,7 @@
       </w:pPr>
       <w:r>
         <w:rPr>
-          <w:rFonts w:ascii="Calibri" w:cs="Calibri" w:eastAsia="Calibri" w:hAnsi="Calibri"/>
+          <w:rFonts w:ascii="Arial" w:cs="Arial" w:eastAsia="Arial" w:hAnsi="Arial"/>
         </w:rPr>
         <w:t xml:space="preserve">1. Collateral is reserved at the limit price, not mid</w:t>
       </w:r>
@@ -481,13 +460,13 @@
     <w:p>
       <w:r>
         <w:rPr>
-          <w:rFonts w:ascii="Calibri" w:cs="Calibri" w:eastAsia="Calibri" w:hAnsi="Calibri"/>
+          <w:rFonts w:ascii="Arial" w:cs="Arial" w:eastAsia="Arial" w:hAnsi="Arial"/>
         </w:rPr>
         <w:t xml:space="preserve">A buy reserves collateral sized at the </w:t>
       </w:r>
       <w:r>
         <w:rPr>
-          <w:rFonts w:ascii="Calibri" w:cs="Calibri" w:eastAsia="Calibri" w:hAnsi="Calibri"/>
+          <w:rFonts w:ascii="Arial" w:cs="Arial" w:eastAsia="Arial" w:hAnsi="Arial"/>
           <w:b/>
           <w:bCs/>
         </w:rPr>
@@ -495,7 +474,7 @@
       </w:r>
       <w:r>
         <w:rPr>
-          <w:rFonts w:ascii="Calibri" w:cs="Calibri" w:eastAsia="Calibri" w:hAnsi="Calibri"/>
+          <w:rFonts w:ascii="Arial" w:cs="Arial" w:eastAsia="Arial" w:hAnsi="Arial"/>
         </w:rPr>
         <w:t xml:space="preserve"> price (above mid by the slip), so a leg whose notional equals the free balance pre-reverts on the very first order. We cap legs at ~0.95× free balance to avoid it. Defensible behavior, but not obvious from the docs — a one-line note (“orders reserve collateral at the limit price, not mid”) would save integrators a debugging session.</w:t>
       </w:r>
@@ -506,7 +485,7 @@
       </w:pPr>
       <w:r>
         <w:rPr>
-          <w:rFonts w:ascii="Calibri" w:cs="Calibri" w:eastAsia="Calibri" w:hAnsi="Calibri"/>
+          <w:rFonts w:ascii="Arial" w:cs="Arial" w:eastAsia="Arial" w:hAnsi="Arial"/>
         </w:rPr>
         <w:t xml:space="preserve">2. Per-pair book depth varies wildly</w:t>
       </w:r>
@@ -514,9 +493,9 @@
     <w:p>
       <w:r>
         <w:rPr>
-          <w:rFonts w:ascii="Calibri" w:cs="Calibri" w:eastAsia="Calibri" w:hAnsi="Calibri"/>
-        </w:rPr>
-        <w:t xml:space="preserve">Top-of-book depth on one pair was ~$8k while another pair's bid side was ~$100 at the same instant. Depth-aware sizing handles this, but a naive fixed-leg taker will silently walk the thin book and pay far more than the quoted spread. Not a bug — just worth surfacing that per-pair depth is highly uneven, so integrators size to the touch rather than to a fixed notional.</w:t>
+          <w:rFonts w:ascii="Arial" w:cs="Arial" w:eastAsia="Arial" w:hAnsi="Arial"/>
+        </w:rPr>
+        <w:t xml:space="preserve">Top-of-book depth on one pair was ~$8k while another pair’s bid side was ~$100 at the same instant. Depth-aware sizing handles this, but a naive fixed-leg taker will silently walk the thin book and pay far more than the quoted spread. Not a bug — just worth surfacing that per-pair depth is highly uneven, so integrators size to the touch rather than to a fixed notional.</w:t>
       </w:r>
     </w:p>
     <w:p>
@@ -525,7 +504,7 @@
       </w:pPr>
       <w:r>
         <w:rPr>
-          <w:rFonts w:ascii="Calibri" w:cs="Calibri" w:eastAsia="Calibri" w:hAnsi="Calibri"/>
+          <w:rFonts w:ascii="Arial" w:cs="Arial" w:eastAsia="Arial" w:hAnsi="Arial"/>
         </w:rPr>
         <w:t xml:space="preserve">3. Endpoint availability</w:t>
       </w:r>
@@ -533,7 +512,7 @@
     <w:p>
       <w:r>
         <w:rPr>
-          <w:rFonts w:ascii="Calibri" w:cs="Calibri" w:eastAsia="Calibri" w:hAnsi="Calibri"/>
+          <w:rFonts w:ascii="Arial" w:cs="Arial" w:eastAsia="Arial" w:hAnsi="Arial"/>
         </w:rPr>
         <w:t xml:space="preserve">During the round, every public Somnia RPC endpoint we use went unreachable at the same time for a stretch (our failover cycled through all of them and exhausted). Our engine handled it — it self-stops cleanly and flattens — but a synchronized outage is a real availability risk for anything automated against the exchange. Documented rate limits and at least one more independent endpoint would reduce the blast radius.</w:t>
       </w:r>
@@ -544,7 +523,7 @@
       </w:pPr>
       <w:r>
         <w:rPr>
-          <w:rFonts w:ascii="Calibri" w:cs="Calibri" w:eastAsia="Calibri" w:hAnsi="Calibri"/>
+          <w:rFonts w:ascii="Arial" w:cs="Arial" w:eastAsia="Arial" w:hAnsi="Arial"/>
         </w:rPr>
         <w:t xml:space="preserve">Carry-over from Round 1 findings</w:t>
       </w:r>
@@ -552,14 +531,14 @@
     <w:p>
       <w:r>
         <w:rPr>
-          <w:rFonts w:ascii="Calibri" w:cs="Calibri" w:eastAsia="Calibri" w:hAnsi="Calibri"/>
+          <w:rFonts w:ascii="Arial" w:cs="Arial" w:eastAsia="Arial" w:hAnsi="Arial"/>
         </w:rPr>
         <w:t xml:space="preserve">The protocol findings filed in Round 1 (</w:t>
       </w:r>
       <w:r>
         <w:rPr>
           <w:rFonts w:ascii="Consolas" w:cs="Consolas" w:eastAsia="Consolas" w:hAnsi="Consolas"/>
-          <w:color w:val="9A3B6B"/>
+          <w:color w:val="8A2B5E"/>
           <w:sz w:val="19"/>
           <w:szCs w:val="19"/>
         </w:rPr>
@@ -567,14 +546,14 @@
       </w:r>
       <w:r>
         <w:rPr>
-          <w:rFonts w:ascii="Calibri" w:cs="Calibri" w:eastAsia="Calibri" w:hAnsi="Calibri"/>
+          <w:rFonts w:ascii="Arial" w:cs="Arial" w:eastAsia="Arial" w:hAnsi="Arial"/>
         </w:rPr>
         <w:t xml:space="preserve">) still make useful regression targets — a few were confirmed and fixed by the team. The pre-trade </w:t>
       </w:r>
       <w:r>
         <w:rPr>
           <w:rFonts w:ascii="Consolas" w:cs="Consolas" w:eastAsia="Consolas" w:hAnsi="Consolas"/>
-          <w:color w:val="9A3B6B"/>
+          <w:color w:val="8A2B5E"/>
           <w:sz w:val="19"/>
           <w:szCs w:val="19"/>
         </w:rPr>
@@ -582,14 +561,14 @@
       </w:r>
       <w:r>
         <w:rPr>
-          <w:rFonts w:ascii="Calibri" w:cs="Calibri" w:eastAsia="Calibri" w:hAnsi="Calibri"/>
+          <w:rFonts w:ascii="Arial" w:cs="Arial" w:eastAsia="Arial" w:hAnsi="Arial"/>
         </w:rPr>
         <w:t xml:space="preserve"> false-negative rate and the </w:t>
       </w:r>
       <w:r>
         <w:rPr>
           <w:rFonts w:ascii="Consolas" w:cs="Consolas" w:eastAsia="Consolas" w:hAnsi="Consolas"/>
-          <w:color w:val="9A3B6B"/>
+          <w:color w:val="8A2B5E"/>
           <w:sz w:val="19"/>
           <w:szCs w:val="19"/>
         </w:rPr>
@@ -597,7 +576,7 @@
       </w:r>
       <w:r>
         <w:rPr>
-          <w:rFonts w:ascii="Calibri" w:cs="Calibri" w:eastAsia="Calibri" w:hAnsi="Calibri"/>
+          <w:rFonts w:ascii="Arial" w:cs="Arial" w:eastAsia="Arial" w:hAnsi="Arial"/>
         </w:rPr>
         <w:t xml:space="preserve"> event semantics are the two most worth double-checking still hold after recent changes.</w:t>
       </w:r>
@@ -605,7 +584,7 @@
     <w:sectPr>
       <w:footerReference w:type="default" r:id="rId7"/>
       <w:pgSz w:w="12240" w:h="15840" w:orient="portrait"/>
-      <w:pgMar w:top="1120" w:right="1320" w:bottom="1200" w:left="1320" w:header="708" w:footer="708" w:gutter="0"/>
+      <w:pgMar w:top="1300" w:right="1400" w:bottom="1200" w:left="1400" w:header="708" w:footer="708" w:gutter="0"/>
       <w:pgNumType/>
       <w:docGrid w:linePitch="360"/>
     </w:sectPr>
@@ -659,31 +638,22 @@
   <w:p>
     <w:pPr>
       <w:pBdr>
-        <w:top w:val="single" w:color="D8DCEA" w:sz="4" w:space="8"/>
+        <w:top w:val="single" w:color="E2E5EE" w:sz="4" w:space="8"/>
       </w:pBdr>
       <w:jc w:val="center"/>
     </w:pPr>
     <w:r>
       <w:rPr>
-        <w:rFonts w:ascii="Calibri" w:cs="Calibri" w:eastAsia="Calibri" w:hAnsi="Calibri"/>
-        <w:color w:val="6A6A78"/>
+        <w:rFonts w:ascii="Arial" w:cs="Arial" w:eastAsia="Arial" w:hAnsi="Arial"/>
+        <w:color w:val="5A6072"/>
         <w:sz w:val="15"/>
         <w:szCs w:val="15"/>
       </w:rPr>
-      <w:t xml:space="preserve">DreamDEX Round 4 · Builder Feedback     </w:t>
+      <w:t xml:space="preserve">DreamDEX Round 4 · Builder Feedback     page </w:t>
     </w:r>
     <w:r>
       <w:rPr>
-        <w:rFonts w:ascii="Calibri" w:cs="Calibri" w:eastAsia="Calibri" w:hAnsi="Calibri"/>
-        <w:color w:val="6A6A78"/>
-        <w:sz w:val="15"/>
-        <w:szCs w:val="15"/>
-      </w:rPr>
-      <w:t xml:space="preserve">page </w:t>
-    </w:r>
-    <w:r>
-      <w:rPr>
-        <w:color w:val="6A6A78"/>
+        <w:color w:val="5A6072"/>
         <w:sz w:val="15"/>
         <w:szCs w:val="15"/>
       </w:rPr>
@@ -827,7 +797,7 @@
       <w:lvlText w:val="•"/>
       <w:lvlJc w:val="left"/>
       <w:pPr>
-        <w:ind w:left="440" w:hanging="230"/>
+        <w:ind w:left="420" w:hanging="220"/>
       </w:pPr>
     </w:lvl>
   </w:abstractNum>
@@ -851,8 +821,8 @@
   <w:docDefaults>
     <w:rPrDefault>
       <w:rPr>
-        <w:rFonts w:ascii="Calibri" w:cs="Calibri" w:eastAsia="Calibri" w:hAnsi="Calibri"/>
-        <w:color w:val="23232C"/>
+        <w:rFonts w:ascii="Arial" w:cs="Arial" w:eastAsia="Arial" w:hAnsi="Arial"/>
+        <w:color w:val="1F2430"/>
         <w:sz w:val="21"/>
         <w:szCs w:val="21"/>
       </w:rPr>
@@ -1037,18 +1007,18 @@
     <w:qFormat/>
     <w:pPr>
       <w:pBdr>
-        <w:bottom w:val="single" w:color="2E5BD6" w:sz="6" w:space="6"/>
+        <w:bottom w:val="single" w:color="E2E5EE" w:sz="4" w:space="6"/>
       </w:pBdr>
-      <w:spacing w:after="120" w:before="300"/>
+      <w:spacing w:after="120" w:before="320"/>
       <w:outlineLvl w:val="0"/>
     </w:pPr>
     <w:rPr>
-      <w:rFonts w:ascii="Calibri" w:cs="Calibri" w:eastAsia="Calibri" w:hAnsi="Calibri"/>
+      <w:rFonts w:ascii="Arial" w:cs="Arial" w:eastAsia="Arial" w:hAnsi="Arial"/>
       <w:b/>
       <w:bCs/>
-      <w:color w:val="13131C"/>
-      <w:sz w:val="27"/>
-      <w:szCs w:val="27"/>
+      <w:color w:val="141824"/>
+      <w:sz w:val="26"/>
+      <w:szCs w:val="26"/>
     </w:rPr>
   </w:style>
   <w:style w:type="paragraph" w:styleId="Heading2">
@@ -1057,16 +1027,16 @@
     <w:next w:val="Normal"/>
     <w:qFormat/>
     <w:pPr>
-      <w:spacing w:after="70" w:before="200"/>
+      <w:spacing w:after="70" w:before="220"/>
       <w:outlineLvl w:val="1"/>
     </w:pPr>
     <w:rPr>
-      <w:rFonts w:ascii="Calibri" w:cs="Calibri" w:eastAsia="Calibri" w:hAnsi="Calibri"/>
+      <w:rFonts w:ascii="Arial" w:cs="Arial" w:eastAsia="Arial" w:hAnsi="Arial"/>
       <w:b/>
       <w:bCs/>
-      <w:color w:val="2E5BD6"/>
-      <w:sz w:val="23"/>
-      <w:szCs w:val="23"/>
+      <w:color w:val="3457C5"/>
+      <w:sz w:val="22"/>
+      <w:szCs w:val="22"/>
     </w:rPr>
   </w:style>
 </w:styles>

</xml_diff>